<commit_message>
tvist: sync SKILL.md + all four executive artifacts with current service
Regenerated brief PDF, summary PDF, DOCX, and deck PPTX with verified
figures: 33 endpoints, 61 service tests, 586 rig tests, 647 green
project-wide; added the new site functionality (executive-summary
teaser, jurisdiction globe with live legal clauses, Nash 1-1/1-n/n-n
visualizer, GET /regions/suggest suggested start) to the summary
documents, EXECUTIVE-SUMMARY.md, and SKILL.md's dual-use note.
Artifact contents verified via pdftotext / unzip before shipping.
</commit_message>
<xml_diff>
--- a/docs/tvist/Tvist-Executive-Summary.docx
+++ b/docs/tvist/Tvist-Executive-Summary.docx
@@ -62,7 +62,7 @@
           <w:sz w:val="20"/>
           <w:szCs w:val="20"/>
         </w:rPr>
-        <w:t xml:space="preserve">22 jurisdictions · 30 live endpoints · 7 legal categories · 4 trust relationships · 595 tests green</w:t>
+        <w:t xml:space="preserve">22 jurisdictions · 33 live endpoints · 7 legal categories · 4 trust relationships · 647 tests green</w:t>
       </w:r>
     </w:p>
     <w:p>
@@ -6242,7 +6242,7 @@
           <w:sz w:val="21"/>
           <w:szCs w:val="21"/>
         </w:rPr>
-        <w:t xml:space="preserve">Tvist ships as a payments-layer plugin in MIT/NANDA's Nanda Town agent test rig: 4 swarm scenarios, 10 adversarial validators. Every attack — unilateral clawback, escrow drain, over-mandate spend, friendly-fraud refund, off-regime dispute — passes against the default ledger and is blocked by Tvist on identical scenarios. 539 tests green in the rig repo.</w:t>
+        <w:t xml:space="preserve">Tvist ships as a payments-layer plugin in MIT/NANDA's Nanda Town agent test rig: 4 swarm scenarios, 10 adversarial validators. Every attack — unilateral clawback, escrow drain, over-mandate spend, friendly-fraud refund, off-regime dispute — passes against the default ledger and is blocked by Tvist on identical scenarios. 586 tests green in the rig repo.</w:t>
       </w:r>
     </w:p>
     <w:p>
@@ -6270,7 +6270,7 @@
           <w:sz w:val="21"/>
           <w:szCs w:val="21"/>
         </w:rPr>
-        <w:t xml:space="preserve">30 endpoints including the legal-taxonomy, x402, M2M, and spectrum surfaces; a single SKILL.md is enough for an agent to succeed unaided (verified end-to-end); 56 endpoint tests green — 595 green across the project. The animated site includes a live playground, a clickable trust-spectrum and pipeline, a jurisdiction law explorer, and self-verifying gate tables.</w:t>
+        <w:t xml:space="preserve">33 endpoints including the legal-taxonomy, x402, M2M, and spectrum surfaces; a single SKILL.md is enough for an agent to succeed unaided (verified end-to-end); 61 endpoint tests green — 647 green across the project. The animated site includes an executive-summary teaser, an interactive jurisdiction globe whose per-region legal clauses load live from the API, a Nash cooperation visualizer (1–1, 1–n, n–n — one real recommend call per pair), a suggested-start jurisdiction from GET /regions/suggest (timezone/locale; IP echoed, not geolocated), a live playground, a clickable trust-spectrum and pipeline, a jurisdiction law explorer, and self-verifying gate tables.</w:t>
       </w:r>
     </w:p>
     <w:p>

</xml_diff>

<commit_message>
artifacts: rebrand to tvist.api, add live URL, regenerate PDFs
- Brief + summary PDFs regenerated from new committed generators
  (tools/make_brief_pdf.py, make_summary_pdf.py — the old scratchpad
  generators were lost): tvist.api brand, current verified figures
  (33 endpoints, 61/586/647 tests, 41/41 live sweep), live Vercel URL,
  sources, disclaimer.
- DOCX + PPTX patched in place (XML text runs): brand .ai -> .api and
  the live URL added to the overview/proof slides and before the DOCX
  disclaimer; well-formedness verified.
- EXECUTIVE-SUMMARY.md: same rebrand + live link.
</commit_message>
<xml_diff>
--- a/docs/tvist/Tvist-Executive-Summary.docx
+++ b/docs/tvist/Tvist-Executive-Summary.docx
@@ -24,7 +24,7 @@
           <w:sz w:val="56"/>
           <w:szCs w:val="56"/>
         </w:rPr>
-        <w:t xml:space="preserve">.ai</w:t>
+        <w:t xml:space="preserve">.api</w:t>
       </w:r>
       <w:r>
         <w:rPr>
@@ -6348,6 +6348,23 @@
           <w:szCs w:val="21"/>
         </w:rPr>
         <w:t xml:space="preserve">Complementary, not competitive: to networks (we operationalize their intent standards), to custody providers (we are their missing rules engine), and to agent platforms (we are the trust layer their checkout protocols defer). The wedge is the cross-section nobody owns — and it compounds: every new rail, protocol, and jurisdiction added to the registry makes the layer harder to replicate.</w:t>
+      </w:r>
+    </w:p>
+    <w:p>
+      <w:r>
+        <w:rPr>
+          <w:b/>
+          <w:color w:val="0F766E"/>
+          <w:sz w:val="21"/>
+        </w:rPr>
+        <w:t xml:space="preserve">Live: </w:t>
+      </w:r>
+      <w:r>
+        <w:rPr>
+          <w:sz w:val="21"/>
+          <w:color w:val="101736"/>
+        </w:rPr>
+        <w:t xml:space="preserve">https://tvist-api-mias-projects-667d1349.vercel.app · agent contract: https://tvist-api-mias-projects-667d1349.vercel.app/skill.md · source: github.com/superheroin888/tvist-api</w:t>
       </w:r>
     </w:p>
     <w:p>

</xml_diff>